<commit_message>
feat(pandoc): update to v3.12
</commit_message>
<xml_diff>
--- a/tests/func/test_convert_syntax_markdown.out.docx
+++ b/tests/func/test_convert_syntax_markdown.out.docx
@@ -331,7 +331,7 @@
       <w:r>
         <w:t xml:space="preserve">Bloggs and Jones (</w:t>
       </w:r>
-      <w:hyperlink w:anchor="ref-bloggs-jones">
+      <w:hyperlink w:anchor="_e52005b13665ed6202528cfa855a689f39958a7">
         <w:r>
           <w:rPr>
             <w:rStyle w:val="Hyperlink"/>
@@ -350,7 +350,7 @@
       <w:r>
         <w:t xml:space="preserve">(</w:t>
       </w:r>
-      <w:hyperlink w:anchor="ref-chomsky-73">
+      <w:hyperlink w:anchor="_fc648d2be0cfa86a9d4b72d348eb8c845472eac">
         <w:r>
           <w:rPr>
             <w:rStyle w:val="Hyperlink"/>
@@ -612,11 +612,12 @@
         <w:t xml:space="preserve">House of Dude</w:t>
       </w:r>
     </w:p>
-    <w:bookmarkStart w:id="15" w:name="refs"/>
-    <w:bookmarkStart w:id="13" w:name="ref-bloggs-jones"/>
+    <w:bookmarkStart w:id="15" w:name="_refs"/>
+    <w:bookmarkStart w:id="13" w:name="_e52005b13665ed6202528cfa855a689f39958a7"/>
     <w:p>
       <w:pPr>
         <w:pStyle w:val="Bibliography"/>
+        <w:ind w:left="720" w:hanging="720"/>
       </w:pPr>
       <w:r>
         <w:t xml:space="preserve">Bloggs, A. J., and X. Y. Jones. 1959.</w:t>
@@ -642,10 +643,11 @@
       </w:r>
     </w:p>
     <w:bookmarkEnd w:id="13"/>
-    <w:bookmarkStart w:id="14" w:name="ref-chomsky-73"/>
+    <w:bookmarkStart w:id="14" w:name="_fc648d2be0cfa86a9d4b72d348eb8c845472eac"/>
     <w:p>
       <w:pPr>
         <w:pStyle w:val="Bibliography"/>
+        <w:ind w:left="720" w:hanging="720"/>
       </w:pPr>
       <w:r>
         <w:t xml:space="preserve">Chomsky, N. 1973.</w:t>
@@ -679,8 +681,8 @@
     <w:bookmarkEnd w:id="14"/>
     <w:bookmarkEnd w:id="15"/>
     <w:sectPr>
-      <w:pgSz w:h="12240" w:orient="landscape" w:w="15840"/>
-      <w:pgMar w:bottom="720" w:footer="720" w:gutter="0" w:header="720" w:left="720" w:right="720" w:top="720"/>
+      <w:pgSz w:w="15840" w:h="12240" w:orient="landscape"/>
+      <w:pgMar w:top="720" w:right="720" w:bottom="720" w:left="720" w:header="720" w:footer="720" w:gutter="0"/>
       <w:cols w:space="720"/>
       <w:docGrid w:linePitch="326"/>
     </w:sectPr>
@@ -712,8 +714,8 @@
 </file>
 
 <file path=word/numbering.xml><?xml version="1.0" encoding="utf-8"?>
-<w:numbering xmlns:aink="http://schemas.microsoft.com/office/drawing/2016/ink" xmlns:am3d="http://schemas.microsoft.com/office/drawing/2017/model3d" xmlns:cx="http://schemas.microsoft.com/office/drawing/2014/chartex" xmlns:cx1="http://schemas.microsoft.com/office/drawing/2015/9/8/chartex" xmlns:cx2="http://schemas.microsoft.com/office/drawing/2015/10/21/chartex" xmlns:cx3="http://schemas.microsoft.com/office/drawing/2016/5/9/chartex" xmlns:cx4="http://schemas.microsoft.com/office/drawing/2016/5/10/chartex" xmlns:cx5="http://schemas.microsoft.com/office/drawing/2016/5/11/chartex" xmlns:cx6="http://schemas.microsoft.com/office/drawing/2016/5/12/chartex" xmlns:cx7="http://schemas.microsoft.com/office/drawing/2016/5/13/chartex" xmlns:cx8="http://schemas.microsoft.com/office/drawing/2016/5/14/chartex" xmlns:m="http://schemas.openxmlformats.org/officeDocument/2006/math" xmlns:mc="http://schemas.openxmlformats.org/markup-compatibility/2006" xmlns:o="urn:schemas-microsoft-com:office:office" xmlns:r="http://schemas.openxmlformats.org/officeDocument/2006/relationships" xmlns:v="urn:schemas-microsoft-com:vml" xmlns:w="http://schemas.openxmlformats.org/wordprocessingml/2006/main" xmlns:w10="urn:schemas-microsoft-com:office:word" xmlns:w14="http://schemas.microsoft.com/office/word/2010/wordml" xmlns:w15="http://schemas.microsoft.com/office/word/2012/wordml" xmlns:w16="http://schemas.microsoft.com/office/word/2018/wordml" xmlns:w16cex="http://schemas.microsoft.com/office/word/2018/wordml/cex" xmlns:w16cid="http://schemas.microsoft.com/office/word/2016/wordml/cid" xmlns:w16se="http://schemas.microsoft.com/office/word/2015/wordml/symex" xmlns:wne="http://schemas.microsoft.com/office/word/2006/wordml" xmlns:wp="http://schemas.openxmlformats.org/drawingml/2006/wordprocessingDrawing" xmlns:wp14="http://schemas.microsoft.com/office/word/2010/wordprocessingDrawing" xmlns:wpc="http://schemas.microsoft.com/office/word/2010/wordprocessingCanvas" xmlns:wpg="http://schemas.microsoft.com/office/word/2010/wordprocessingGroup" xmlns:wpi="http://schemas.microsoft.com/office/word/2010/wordprocessingInk" xmlns:wps="http://schemas.microsoft.com/office/word/2010/wordprocessingShape" mc:Ignorable="w14 w15 w16se w16cid w16 w16cex wp14">
-  <w:abstractNum w15:restartNumberingAfterBreak="0" w:abstractNumId="0">
+<w:numbering xmlns:wpc="http://schemas.microsoft.com/office/word/2010/wordprocessingCanvas" xmlns:cx="http://schemas.microsoft.com/office/drawing/2014/chartex" xmlns:cx1="http://schemas.microsoft.com/office/drawing/2015/9/8/chartex" xmlns:cx2="http://schemas.microsoft.com/office/drawing/2015/10/21/chartex" xmlns:cx3="http://schemas.microsoft.com/office/drawing/2016/5/9/chartex" xmlns:cx4="http://schemas.microsoft.com/office/drawing/2016/5/10/chartex" xmlns:cx5="http://schemas.microsoft.com/office/drawing/2016/5/11/chartex" xmlns:cx6="http://schemas.microsoft.com/office/drawing/2016/5/12/chartex" xmlns:cx7="http://schemas.microsoft.com/office/drawing/2016/5/13/chartex" xmlns:cx8="http://schemas.microsoft.com/office/drawing/2016/5/14/chartex" xmlns:mc="http://schemas.openxmlformats.org/markup-compatibility/2006" xmlns:aink="http://schemas.microsoft.com/office/drawing/2016/ink" xmlns:am3d="http://schemas.microsoft.com/office/drawing/2017/model3d" xmlns:o="urn:schemas-microsoft-com:office:office" xmlns:r="http://schemas.openxmlformats.org/officeDocument/2006/relationships" xmlns:m="http://schemas.openxmlformats.org/officeDocument/2006/math" xmlns:v="urn:schemas-microsoft-com:vml" xmlns:wp14="http://schemas.microsoft.com/office/word/2010/wordprocessingDrawing" xmlns:wp="http://schemas.openxmlformats.org/drawingml/2006/wordprocessingDrawing" xmlns:w10="urn:schemas-microsoft-com:office:word" xmlns:w="http://schemas.openxmlformats.org/wordprocessingml/2006/main" xmlns:w14="http://schemas.microsoft.com/office/word/2010/wordml" xmlns:w15="http://schemas.microsoft.com/office/word/2012/wordml" xmlns:w16cex="http://schemas.microsoft.com/office/word/2018/wordml/cex" xmlns:w16cid="http://schemas.microsoft.com/office/word/2016/wordml/cid" xmlns:w16="http://schemas.microsoft.com/office/word/2018/wordml" xmlns:w16se="http://schemas.microsoft.com/office/word/2015/wordml/symex" xmlns:wpg="http://schemas.microsoft.com/office/word/2010/wordprocessingGroup" xmlns:wpi="http://schemas.microsoft.com/office/word/2010/wordprocessingInk" xmlns:wne="http://schemas.microsoft.com/office/word/2006/wordml" xmlns:wps="http://schemas.microsoft.com/office/word/2010/wordprocessingShape" mc:Ignorable="w14 w15 w16se w16cid w16 w16cex wp14">
+  <w:abstractNum w:abstractNumId="0" w15:restartNumberingAfterBreak="0">
     <w:nsid w:val="170CD2DE"/>
     <w:multiLevelType w:val="multilevel"/>
     <w:tmpl w:val="B9184D00"/>
@@ -723,9 +725,9 @@
       <w:lvlJc w:val="left"/>
       <w:pPr>
         <w:tabs>
-          <w:tab w:pos="0" w:val="num"/>
+          <w:tab w:val="num" w:pos="0"/>
         </w:tabs>
-        <w:ind w:hanging="480" w:left="480"/>
+        <w:ind w:left="480" w:hanging="480"/>
       </w:pPr>
     </w:lvl>
     <w:lvl w:ilvl="1">
@@ -734,9 +736,9 @@
       <w:lvlJc w:val="left"/>
       <w:pPr>
         <w:tabs>
-          <w:tab w:pos="720" w:val="num"/>
+          <w:tab w:val="num" w:pos="720"/>
         </w:tabs>
-        <w:ind w:hanging="480" w:left="1200"/>
+        <w:ind w:left="1200" w:hanging="480"/>
       </w:pPr>
     </w:lvl>
     <w:lvl w:ilvl="2">
@@ -745,9 +747,9 @@
       <w:lvlJc w:val="left"/>
       <w:pPr>
         <w:tabs>
-          <w:tab w:pos="1440" w:val="num"/>
+          <w:tab w:val="num" w:pos="1440"/>
         </w:tabs>
-        <w:ind w:hanging="480" w:left="1920"/>
+        <w:ind w:left="1920" w:hanging="480"/>
       </w:pPr>
     </w:lvl>
     <w:lvl w:ilvl="3">
@@ -756,9 +758,9 @@
       <w:lvlJc w:val="left"/>
       <w:pPr>
         <w:tabs>
-          <w:tab w:pos="2160" w:val="num"/>
+          <w:tab w:val="num" w:pos="2160"/>
         </w:tabs>
-        <w:ind w:hanging="480" w:left="2640"/>
+        <w:ind w:left="2640" w:hanging="480"/>
       </w:pPr>
     </w:lvl>
     <w:lvl w:ilvl="4">
@@ -767,9 +769,9 @@
       <w:lvlJc w:val="left"/>
       <w:pPr>
         <w:tabs>
-          <w:tab w:pos="2880" w:val="num"/>
+          <w:tab w:val="num" w:pos="2880"/>
         </w:tabs>
-        <w:ind w:hanging="480" w:left="3360"/>
+        <w:ind w:left="3360" w:hanging="480"/>
       </w:pPr>
     </w:lvl>
     <w:lvl w:ilvl="5">
@@ -778,9 +780,9 @@
       <w:lvlJc w:val="left"/>
       <w:pPr>
         <w:tabs>
-          <w:tab w:pos="3600" w:val="num"/>
+          <w:tab w:val="num" w:pos="3600"/>
         </w:tabs>
-        <w:ind w:hanging="480" w:left="4080"/>
+        <w:ind w:left="4080" w:hanging="480"/>
       </w:pPr>
     </w:lvl>
     <w:lvl w:ilvl="6">
@@ -789,9 +791,9 @@
       <w:lvlJc w:val="left"/>
       <w:pPr>
         <w:tabs>
-          <w:tab w:pos="4320" w:val="num"/>
+          <w:tab w:val="num" w:pos="4320"/>
         </w:tabs>
-        <w:ind w:hanging="480" w:left="4800"/>
+        <w:ind w:left="4800" w:hanging="480"/>
       </w:pPr>
     </w:lvl>
     <w:lvl w:ilvl="7">
@@ -800,9 +802,9 @@
       <w:lvlJc w:val="left"/>
       <w:pPr>
         <w:tabs>
-          <w:tab w:pos="5040" w:val="num"/>
+          <w:tab w:val="num" w:pos="5040"/>
         </w:tabs>
-        <w:ind w:hanging="480" w:left="5520"/>
+        <w:ind w:left="5520" w:hanging="480"/>
       </w:pPr>
     </w:lvl>
     <w:lvl w:ilvl="8">
@@ -811,9 +813,9 @@
       <w:lvlJc w:val="left"/>
       <w:pPr>
         <w:tabs>
-          <w:tab w:pos="5760" w:val="num"/>
+          <w:tab w:val="num" w:pos="5760"/>
         </w:tabs>
-        <w:ind w:hanging="480" w:left="6240"/>
+        <w:ind w:left="6240" w:hanging="480"/>
       </w:pPr>
     </w:lvl>
   </w:abstractNum>
@@ -1012,14 +1014,14 @@
 </file>
 
 <file path=word/styles.xml><?xml version="1.0" encoding="utf-8"?>
-<w:styles xmlns:mc="http://schemas.openxmlformats.org/markup-compatibility/2006" xmlns:r="http://schemas.openxmlformats.org/officeDocument/2006/relationships" xmlns:w="http://schemas.openxmlformats.org/wordprocessingml/2006/main" xmlns:w14="http://schemas.microsoft.com/office/word/2010/wordml" xmlns:w15="http://schemas.microsoft.com/office/word/2012/wordml" xmlns:w16="http://schemas.microsoft.com/office/word/2018/wordml" xmlns:w16cex="http://schemas.microsoft.com/office/word/2018/wordml/cex" xmlns:w16cid="http://schemas.microsoft.com/office/word/2016/wordml/cid" xmlns:w16se="http://schemas.microsoft.com/office/word/2015/wordml/symex" mc:Ignorable="w14 w15 w16se w16cid w16 w16cex">
+<w:styles xmlns:mc="http://schemas.openxmlformats.org/markup-compatibility/2006" xmlns:r="http://schemas.openxmlformats.org/officeDocument/2006/relationships" xmlns:w="http://schemas.openxmlformats.org/wordprocessingml/2006/main" xmlns:w14="http://schemas.microsoft.com/office/word/2010/wordml" xmlns:w15="http://schemas.microsoft.com/office/word/2012/wordml" xmlns:w16cex="http://schemas.microsoft.com/office/word/2018/wordml/cex" xmlns:w16cid="http://schemas.microsoft.com/office/word/2016/wordml/cid" xmlns:w16="http://schemas.microsoft.com/office/word/2018/wordml" xmlns:w16se="http://schemas.microsoft.com/office/word/2015/wordml/symex" mc:Ignorable="w14 w15 w16se w16cid w16 w16cex">
   <w:docDefaults>
     <w:rPrDefault>
       <w:rPr>
-        <w:rFonts w:asciiTheme="minorHAnsi" w:cstheme="minorBidi" w:eastAsiaTheme="minorHAnsi" w:hAnsiTheme="minorHAnsi"/>
+        <w:rFonts w:asciiTheme="minorHAnsi" w:eastAsiaTheme="minorHAnsi" w:hAnsiTheme="minorHAnsi" w:cstheme="minorBidi"/>
         <w:sz w:val="24"/>
         <w:szCs w:val="24"/>
-        <w:lang w:bidi="ar-SA" w:eastAsia="en-US" w:val="en-US"/>
+        <w:lang w:val="en-US" w:eastAsia="en-US" w:bidi="ar-SA"/>
       </w:rPr>
     </w:rPrDefault>
     <w:pPrDefault>
@@ -1028,7 +1030,7 @@
       </w:pPr>
     </w:pPrDefault>
   </w:docDefaults>
-  <w:latentStyles w:count="376" w:defLockedState="0" w:defQFormat="0" w:defSemiHidden="0" w:defUIPriority="0" w:defUnhideWhenUsed="0">
+  <w:latentStyles w:defLockedState="0" w:defUIPriority="0" w:defSemiHidden="0" w:defUnhideWhenUsed="0" w:defQFormat="0" w:count="376">
     <w:lsdException w:name="heading 5" w:semiHidden="1" w:unhideWhenUsed="1"/>
     <w:lsdException w:name="index 2" w:semiHidden="1" w:unhideWhenUsed="1"/>
     <w:lsdException w:name="index 3" w:semiHidden="1" w:unhideWhenUsed="1"/>
@@ -1359,11 +1361,11 @@
     <w:lsdException w:name="Unresolved Mention" w:semiHidden="1" w:uiPriority="99" w:unhideWhenUsed="1"/>
     <w:lsdException w:name="Smart Link" w:semiHidden="1" w:uiPriority="99" w:unhideWhenUsed="1"/>
   </w:latentStyles>
-  <w:style w:default="1" w:styleId="Normal" w:type="paragraph">
+  <w:style w:type="paragraph" w:default="1" w:styleId="Normal">
     <w:name w:val="Normal"/>
     <w:qFormat/>
   </w:style>
-  <w:style w:styleId="Heading1" w:type="paragraph">
+  <w:style w:type="paragraph" w:styleId="Heading1">
     <w:name w:val="heading 1"/>
     <w:basedOn w:val="Normal"/>
     <w:next w:val="BodyText"/>
@@ -1372,19 +1374,19 @@
     <w:pPr>
       <w:keepNext/>
       <w:keepLines/>
-      <w:spacing w:after="0" w:before="480"/>
+      <w:spacing w:before="480" w:after="0"/>
       <w:outlineLvl w:val="0"/>
     </w:pPr>
     <w:rPr>
-      <w:rFonts w:asciiTheme="majorHAnsi" w:cstheme="majorBidi" w:eastAsiaTheme="majorEastAsia" w:hAnsiTheme="majorHAnsi"/>
+      <w:rFonts w:asciiTheme="majorHAnsi" w:eastAsiaTheme="majorEastAsia" w:hAnsiTheme="majorHAnsi" w:cstheme="majorBidi"/>
       <w:b/>
       <w:bCs/>
-      <w:color w:themeColor="accent1" w:val="4F81BD"/>
+      <w:color w:val="4F81BD" w:themeColor="accent1"/>
       <w:sz w:val="32"/>
       <w:szCs w:val="32"/>
     </w:rPr>
   </w:style>
-  <w:style w:styleId="Heading2" w:type="paragraph">
+  <w:style w:type="paragraph" w:styleId="Heading2">
     <w:name w:val="heading 2"/>
     <w:basedOn w:val="Normal"/>
     <w:next w:val="BodyText"/>
@@ -1394,19 +1396,19 @@
     <w:pPr>
       <w:keepNext/>
       <w:keepLines/>
-      <w:spacing w:after="0" w:before="200"/>
+      <w:spacing w:before="200" w:after="0"/>
       <w:outlineLvl w:val="1"/>
     </w:pPr>
     <w:rPr>
-      <w:rFonts w:asciiTheme="majorHAnsi" w:cstheme="majorBidi" w:eastAsiaTheme="majorEastAsia" w:hAnsiTheme="majorHAnsi"/>
+      <w:rFonts w:asciiTheme="majorHAnsi" w:eastAsiaTheme="majorEastAsia" w:hAnsiTheme="majorHAnsi" w:cstheme="majorBidi"/>
       <w:b/>
       <w:bCs/>
-      <w:color w:themeColor="accent1" w:val="4F81BD"/>
+      <w:color w:val="4F81BD" w:themeColor="accent1"/>
       <w:sz w:val="28"/>
       <w:szCs w:val="28"/>
     </w:rPr>
   </w:style>
-  <w:style w:styleId="Heading3" w:type="paragraph">
+  <w:style w:type="paragraph" w:styleId="Heading3">
     <w:name w:val="heading 3"/>
     <w:basedOn w:val="Normal"/>
     <w:next w:val="BodyText"/>
@@ -1416,17 +1418,17 @@
     <w:pPr>
       <w:keepNext/>
       <w:keepLines/>
-      <w:spacing w:after="0" w:before="200"/>
+      <w:spacing w:before="200" w:after="0"/>
       <w:outlineLvl w:val="2"/>
     </w:pPr>
     <w:rPr>
-      <w:rFonts w:asciiTheme="majorHAnsi" w:cstheme="majorBidi" w:eastAsiaTheme="majorEastAsia" w:hAnsiTheme="majorHAnsi"/>
+      <w:rFonts w:asciiTheme="majorHAnsi" w:eastAsiaTheme="majorEastAsia" w:hAnsiTheme="majorHAnsi" w:cstheme="majorBidi"/>
       <w:b/>
       <w:bCs/>
-      <w:color w:themeColor="accent1" w:val="4F81BD"/>
-    </w:rPr>
-  </w:style>
-  <w:style w:styleId="Heading4" w:type="paragraph">
+      <w:color w:val="4F81BD" w:themeColor="accent1"/>
+    </w:rPr>
+  </w:style>
+  <w:style w:type="paragraph" w:styleId="Heading4">
     <w:name w:val="heading 4"/>
     <w:basedOn w:val="Normal"/>
     <w:next w:val="BodyText"/>
@@ -1436,17 +1438,17 @@
     <w:pPr>
       <w:keepNext/>
       <w:keepLines/>
-      <w:spacing w:after="0" w:before="200"/>
+      <w:spacing w:before="200" w:after="0"/>
       <w:outlineLvl w:val="3"/>
     </w:pPr>
     <w:rPr>
-      <w:rFonts w:asciiTheme="majorHAnsi" w:cstheme="majorBidi" w:eastAsiaTheme="majorEastAsia" w:hAnsiTheme="majorHAnsi"/>
+      <w:rFonts w:asciiTheme="majorHAnsi" w:eastAsiaTheme="majorEastAsia" w:hAnsiTheme="majorHAnsi" w:cstheme="majorBidi"/>
       <w:bCs/>
       <w:i/>
-      <w:color w:themeColor="accent1" w:val="4F81BD"/>
-    </w:rPr>
-  </w:style>
-  <w:style w:styleId="Heading5" w:type="paragraph">
+      <w:color w:val="4F81BD" w:themeColor="accent1"/>
+    </w:rPr>
+  </w:style>
+  <w:style w:type="paragraph" w:styleId="Heading5">
     <w:name w:val="heading 5"/>
     <w:basedOn w:val="Normal"/>
     <w:next w:val="BodyText"/>
@@ -1456,16 +1458,16 @@
     <w:pPr>
       <w:keepNext/>
       <w:keepLines/>
-      <w:spacing w:after="0" w:before="200"/>
+      <w:spacing w:before="200" w:after="0"/>
       <w:outlineLvl w:val="4"/>
     </w:pPr>
     <w:rPr>
-      <w:rFonts w:asciiTheme="majorHAnsi" w:cstheme="majorBidi" w:eastAsiaTheme="majorEastAsia" w:hAnsiTheme="majorHAnsi"/>
+      <w:rFonts w:asciiTheme="majorHAnsi" w:eastAsiaTheme="majorEastAsia" w:hAnsiTheme="majorHAnsi" w:cstheme="majorBidi"/>
       <w:iCs/>
-      <w:color w:themeColor="accent1" w:val="4F81BD"/>
-    </w:rPr>
-  </w:style>
-  <w:style w:styleId="Heading6" w:type="paragraph">
+      <w:color w:val="4F81BD" w:themeColor="accent1"/>
+    </w:rPr>
+  </w:style>
+  <w:style w:type="paragraph" w:styleId="Heading6">
     <w:name w:val="heading 6"/>
     <w:basedOn w:val="Normal"/>
     <w:next w:val="BodyText"/>
@@ -1475,15 +1477,15 @@
     <w:pPr>
       <w:keepNext/>
       <w:keepLines/>
-      <w:spacing w:after="0" w:before="200"/>
+      <w:spacing w:before="200" w:after="0"/>
       <w:outlineLvl w:val="5"/>
     </w:pPr>
     <w:rPr>
-      <w:rFonts w:asciiTheme="majorHAnsi" w:cstheme="majorBidi" w:eastAsiaTheme="majorEastAsia" w:hAnsiTheme="majorHAnsi"/>
-      <w:color w:themeColor="accent1" w:val="4F81BD"/>
-    </w:rPr>
-  </w:style>
-  <w:style w:styleId="Heading7" w:type="paragraph">
+      <w:rFonts w:asciiTheme="majorHAnsi" w:eastAsiaTheme="majorEastAsia" w:hAnsiTheme="majorHAnsi" w:cstheme="majorBidi"/>
+      <w:color w:val="4F81BD" w:themeColor="accent1"/>
+    </w:rPr>
+  </w:style>
+  <w:style w:type="paragraph" w:styleId="Heading7">
     <w:name w:val="heading 7"/>
     <w:basedOn w:val="Normal"/>
     <w:next w:val="BodyText"/>
@@ -1493,15 +1495,15 @@
     <w:pPr>
       <w:keepNext/>
       <w:keepLines/>
-      <w:spacing w:after="0" w:before="200"/>
+      <w:spacing w:before="200" w:after="0"/>
       <w:outlineLvl w:val="6"/>
     </w:pPr>
     <w:rPr>
-      <w:rFonts w:asciiTheme="majorHAnsi" w:cstheme="majorBidi" w:eastAsiaTheme="majorEastAsia" w:hAnsiTheme="majorHAnsi"/>
-      <w:color w:themeColor="accent1" w:val="4F81BD"/>
-    </w:rPr>
-  </w:style>
-  <w:style w:styleId="Heading8" w:type="paragraph">
+      <w:rFonts w:asciiTheme="majorHAnsi" w:eastAsiaTheme="majorEastAsia" w:hAnsiTheme="majorHAnsi" w:cstheme="majorBidi"/>
+      <w:color w:val="4F81BD" w:themeColor="accent1"/>
+    </w:rPr>
+  </w:style>
+  <w:style w:type="paragraph" w:styleId="Heading8">
     <w:name w:val="heading 8"/>
     <w:basedOn w:val="Normal"/>
     <w:next w:val="BodyText"/>
@@ -1511,15 +1513,15 @@
     <w:pPr>
       <w:keepNext/>
       <w:keepLines/>
-      <w:spacing w:after="0" w:before="200"/>
+      <w:spacing w:before="200" w:after="0"/>
       <w:outlineLvl w:val="7"/>
     </w:pPr>
     <w:rPr>
-      <w:rFonts w:asciiTheme="majorHAnsi" w:cstheme="majorBidi" w:eastAsiaTheme="majorEastAsia" w:hAnsiTheme="majorHAnsi"/>
-      <w:color w:themeColor="accent1" w:val="4F81BD"/>
-    </w:rPr>
-  </w:style>
-  <w:style w:styleId="Heading9" w:type="paragraph">
+      <w:rFonts w:asciiTheme="majorHAnsi" w:eastAsiaTheme="majorEastAsia" w:hAnsiTheme="majorHAnsi" w:cstheme="majorBidi"/>
+      <w:color w:val="4F81BD" w:themeColor="accent1"/>
+    </w:rPr>
+  </w:style>
+  <w:style w:type="paragraph" w:styleId="Heading9">
     <w:name w:val="heading 9"/>
     <w:basedOn w:val="Normal"/>
     <w:next w:val="BodyText"/>
@@ -1529,64 +1531,64 @@
     <w:pPr>
       <w:keepNext/>
       <w:keepLines/>
-      <w:spacing w:after="0" w:before="200"/>
+      <w:spacing w:before="200" w:after="0"/>
       <w:outlineLvl w:val="8"/>
     </w:pPr>
     <w:rPr>
-      <w:rFonts w:asciiTheme="majorHAnsi" w:cstheme="majorBidi" w:eastAsiaTheme="majorEastAsia" w:hAnsiTheme="majorHAnsi"/>
-      <w:color w:themeColor="accent1" w:val="4F81BD"/>
-    </w:rPr>
-  </w:style>
-  <w:style w:default="1" w:styleId="DefaultParagraphFont" w:type="character">
+      <w:rFonts w:asciiTheme="majorHAnsi" w:eastAsiaTheme="majorEastAsia" w:hAnsiTheme="majorHAnsi" w:cstheme="majorBidi"/>
+      <w:color w:val="4F81BD" w:themeColor="accent1"/>
+    </w:rPr>
+  </w:style>
+  <w:style w:type="character" w:default="1" w:styleId="DefaultParagraphFont">
     <w:name w:val="Default Paragraph Font"/>
     <w:uiPriority w:val="1"/>
     <w:semiHidden/>
     <w:unhideWhenUsed/>
   </w:style>
-  <w:style w:default="1" w:styleId="TableNormal" w:type="table">
+  <w:style w:type="table" w:default="1" w:styleId="TableNormal">
     <w:name w:val="Normal Table"/>
     <w:uiPriority w:val="99"/>
     <w:semiHidden/>
     <w:unhideWhenUsed/>
     <w:tblPr>
-      <w:tblInd w:type="dxa" w:w="0"/>
+      <w:tblInd w:w="0" w:type="dxa"/>
       <w:tblCellMar>
-        <w:top w:type="dxa" w:w="0"/>
-        <w:left w:type="dxa" w:w="108"/>
-        <w:bottom w:type="dxa" w:w="0"/>
-        <w:right w:type="dxa" w:w="108"/>
+        <w:top w:w="0" w:type="dxa"/>
+        <w:left w:w="108" w:type="dxa"/>
+        <w:bottom w:w="0" w:type="dxa"/>
+        <w:right w:w="108" w:type="dxa"/>
       </w:tblCellMar>
     </w:tblPr>
   </w:style>
-  <w:style w:default="1" w:styleId="NoList" w:type="numbering">
+  <w:style w:type="numbering" w:default="1" w:styleId="NoList">
     <w:name w:val="No List"/>
     <w:uiPriority w:val="99"/>
     <w:semiHidden/>
     <w:unhideWhenUsed/>
   </w:style>
-  <w:style w:styleId="BodyText" w:type="paragraph">
+  <w:style w:type="paragraph" w:styleId="BodyText">
     <w:name w:val="Body Text"/>
     <w:basedOn w:val="Normal"/>
     <w:qFormat/>
     <w:pPr>
-      <w:spacing w:after="180" w:before="180"/>
+      <w:spacing w:before="180" w:after="180"/>
     </w:pPr>
   </w:style>
-  <w:style w:customStyle="1" w:styleId="FirstParagraph" w:type="paragraph">
+  <w:style w:type="paragraph" w:customStyle="1" w:styleId="FirstParagraph">
     <w:name w:val="First Paragraph"/>
     <w:basedOn w:val="BodyText"/>
     <w:next w:val="BodyText"/>
     <w:qFormat/>
   </w:style>
-  <w:style w:customStyle="1" w:styleId="Compact" w:type="paragraph">
+  <w:style w:type="paragraph" w:customStyle="1" w:styleId="Compact">
     <w:name w:val="Compact"/>
     <w:basedOn w:val="BodyText"/>
     <w:qFormat/>
     <w:pPr>
-      <w:spacing w:after="36" w:before="36"/>
+      <w:spacing w:before="36" w:after="36"/>
     </w:pPr>
   </w:style>
-  <w:style w:styleId="Title" w:type="paragraph">
+  <w:style w:type="paragraph" w:styleId="Title">
     <w:name w:val="Title"/>
     <w:basedOn w:val="Normal"/>
     <w:next w:val="BodyText"/>
@@ -1594,19 +1596,19 @@
     <w:pPr>
       <w:keepNext/>
       <w:keepLines/>
-      <w:spacing w:after="240" w:before="480"/>
+      <w:spacing w:before="480" w:after="240"/>
       <w:jc w:val="center"/>
     </w:pPr>
     <w:rPr>
-      <w:rFonts w:asciiTheme="majorHAnsi" w:cstheme="majorBidi" w:eastAsiaTheme="majorEastAsia" w:hAnsiTheme="majorHAnsi"/>
+      <w:rFonts w:asciiTheme="majorHAnsi" w:eastAsiaTheme="majorEastAsia" w:hAnsiTheme="majorHAnsi" w:cstheme="majorBidi"/>
       <w:b/>
       <w:bCs/>
-      <w:color w:themeColor="accent1" w:themeShade="B5" w:val="345A8A"/>
+      <w:color w:val="345A8A" w:themeColor="accent1" w:themeShade="B5"/>
       <w:sz w:val="36"/>
       <w:szCs w:val="36"/>
     </w:rPr>
   </w:style>
-  <w:style w:styleId="Subtitle" w:type="paragraph">
+  <w:style w:type="paragraph" w:styleId="Subtitle">
     <w:name w:val="Subtitle"/>
     <w:basedOn w:val="Title"/>
     <w:next w:val="BodyText"/>
@@ -1619,7 +1621,7 @@
       <w:szCs w:val="30"/>
     </w:rPr>
   </w:style>
-  <w:style w:customStyle="1" w:styleId="Author" w:type="paragraph">
+  <w:style w:type="paragraph" w:customStyle="1" w:styleId="Author">
     <w:name w:val="Author"/>
     <w:next w:val="BodyText"/>
     <w:qFormat/>
@@ -1629,7 +1631,7 @@
       <w:jc w:val="center"/>
     </w:pPr>
   </w:style>
-  <w:style w:styleId="Date" w:type="paragraph">
+  <w:style w:type="paragraph" w:styleId="Date">
     <w:name w:val="Date"/>
     <w:next w:val="BodyText"/>
     <w:qFormat/>
@@ -1639,7 +1641,7 @@
       <w:jc w:val="center"/>
     </w:pPr>
   </w:style>
-  <w:style w:customStyle="1" w:styleId="Abstract" w:type="paragraph">
+  <w:style w:type="paragraph" w:customStyle="1" w:styleId="Abstract">
     <w:name w:val="Abstract"/>
     <w:basedOn w:val="Normal"/>
     <w:next w:val="BodyText"/>
@@ -1647,19 +1649,19 @@
     <w:pPr>
       <w:keepNext/>
       <w:keepLines/>
-      <w:spacing w:after="300" w:before="300"/>
+      <w:spacing w:before="300" w:after="300"/>
     </w:pPr>
     <w:rPr>
       <w:sz w:val="20"/>
       <w:szCs w:val="20"/>
     </w:rPr>
   </w:style>
-  <w:style w:styleId="Bibliography" w:type="paragraph">
+  <w:style w:type="paragraph" w:styleId="Bibliography">
     <w:name w:val="Bibliography"/>
     <w:basedOn w:val="Normal"/>
     <w:qFormat/>
   </w:style>
-  <w:style w:styleId="BlockText" w:type="paragraph">
+  <w:style w:type="paragraph" w:styleId="BlockText">
     <w:name w:val="Block Text"/>
     <w:basedOn w:val="BodyText"/>
     <w:next w:val="BodyText"/>
@@ -1667,33 +1669,33 @@
     <w:unhideWhenUsed/>
     <w:qFormat/>
     <w:pPr>
-      <w:spacing w:after="100" w:before="100"/>
+      <w:spacing w:before="100" w:after="100"/>
       <w:ind w:left="480" w:right="480"/>
     </w:pPr>
   </w:style>
-  <w:style w:styleId="FootnoteText" w:type="paragraph">
+  <w:style w:type="paragraph" w:styleId="FootnoteText">
     <w:name w:val="footnote text"/>
     <w:basedOn w:val="Normal"/>
     <w:uiPriority w:val="9"/>
     <w:unhideWhenUsed/>
     <w:qFormat/>
   </w:style>
-  <w:style w:customStyle="1" w:styleId="Table" w:type="table">
+  <w:style w:type="table" w:customStyle="1" w:styleId="Table">
     <w:name w:val="Table"/>
     <w:semiHidden/>
     <w:unhideWhenUsed/>
     <w:qFormat/>
     <w:tblPr>
-      <w:tblInd w:type="dxa" w:w="0"/>
+      <w:tblInd w:w="0" w:type="dxa"/>
       <w:tblCellMar>
-        <w:top w:type="dxa" w:w="0"/>
-        <w:left w:type="dxa" w:w="108"/>
-        <w:bottom w:type="dxa" w:w="0"/>
-        <w:right w:type="dxa" w:w="108"/>
+        <w:top w:w="0" w:type="dxa"/>
+        <w:left w:w="108" w:type="dxa"/>
+        <w:bottom w:w="0" w:type="dxa"/>
+        <w:right w:w="108" w:type="dxa"/>
       </w:tblCellMar>
     </w:tblPr>
   </w:style>
-  <w:style w:customStyle="1" w:styleId="DefinitionTerm" w:type="paragraph">
+  <w:style w:type="paragraph" w:customStyle="1" w:styleId="DefinitionTerm">
     <w:name w:val="Definition Term"/>
     <w:basedOn w:val="Normal"/>
     <w:next w:val="Definition"/>
@@ -1706,11 +1708,11 @@
       <w:b/>
     </w:rPr>
   </w:style>
-  <w:style w:customStyle="1" w:styleId="Definition" w:type="paragraph">
+  <w:style w:type="paragraph" w:customStyle="1" w:styleId="Definition">
     <w:name w:val="Definition"/>
     <w:basedOn w:val="Normal"/>
   </w:style>
-  <w:style w:styleId="Caption" w:type="paragraph">
+  <w:style w:type="paragraph" w:styleId="Caption">
     <w:name w:val="caption"/>
     <w:basedOn w:val="Normal"/>
     <w:link w:val="CaptionChar"/>
@@ -1721,34 +1723,34 @@
       <w:i/>
     </w:rPr>
   </w:style>
-  <w:style w:customStyle="1" w:styleId="TableCaption" w:type="paragraph">
+  <w:style w:type="paragraph" w:customStyle="1" w:styleId="TableCaption">
     <w:name w:val="Table Caption"/>
     <w:basedOn w:val="Caption"/>
     <w:pPr>
       <w:keepNext/>
     </w:pPr>
   </w:style>
-  <w:style w:customStyle="1" w:styleId="ImageCaption" w:type="paragraph">
+  <w:style w:type="paragraph" w:customStyle="1" w:styleId="ImageCaption">
     <w:name w:val="Image Caption"/>
     <w:basedOn w:val="Caption"/>
   </w:style>
-  <w:style w:customStyle="1" w:styleId="Figure" w:type="paragraph">
+  <w:style w:type="paragraph" w:customStyle="1" w:styleId="Figure">
     <w:name w:val="Figure"/>
     <w:basedOn w:val="Normal"/>
   </w:style>
-  <w:style w:customStyle="1" w:styleId="CaptionedFigure" w:type="paragraph">
+  <w:style w:type="paragraph" w:customStyle="1" w:styleId="CaptionedFigure">
     <w:name w:val="Captioned Figure"/>
     <w:basedOn w:val="Figure"/>
     <w:pPr>
       <w:keepNext/>
     </w:pPr>
   </w:style>
-  <w:style w:customStyle="1" w:styleId="CaptionChar" w:type="character">
+  <w:style w:type="character" w:customStyle="1" w:styleId="CaptionChar">
     <w:name w:val="Caption Char"/>
     <w:basedOn w:val="DefaultParagraphFont"/>
     <w:link w:val="Caption"/>
   </w:style>
-  <w:style w:customStyle="1" w:styleId="VerbatimChar" w:type="character">
+  <w:style w:type="character" w:customStyle="1" w:styleId="VerbatimChar">
     <w:name w:val="Verbatim Char"/>
     <w:basedOn w:val="CaptionChar"/>
     <w:rPr>
@@ -1756,25 +1758,25 @@
       <w:sz w:val="22"/>
     </w:rPr>
   </w:style>
-  <w:style w:customStyle="1" w:styleId="SectionNumber" w:type="character">
+  <w:style w:type="character" w:customStyle="1" w:styleId="SectionNumber">
     <w:name w:val="Section Number"/>
     <w:basedOn w:val="CaptionChar"/>
   </w:style>
-  <w:style w:styleId="FootnoteReference" w:type="character">
+  <w:style w:type="character" w:styleId="FootnoteReference">
     <w:name w:val="footnote reference"/>
     <w:basedOn w:val="CaptionChar"/>
     <w:rPr>
       <w:vertAlign w:val="superscript"/>
     </w:rPr>
   </w:style>
-  <w:style w:styleId="Hyperlink" w:type="character">
+  <w:style w:type="character" w:styleId="Hyperlink">
     <w:name w:val="Hyperlink"/>
     <w:basedOn w:val="CaptionChar"/>
     <w:rPr>
-      <w:color w:themeColor="accent1" w:val="4F81BD"/>
-    </w:rPr>
-  </w:style>
-  <w:style w:styleId="TOCHeading" w:type="paragraph">
+      <w:color w:val="4F81BD" w:themeColor="accent1"/>
+    </w:rPr>
+  </w:style>
+  <w:style w:type="paragraph" w:styleId="TOCHeading">
     <w:name w:val="TOC Heading"/>
     <w:basedOn w:val="Heading1"/>
     <w:next w:val="BodyText"/>
@@ -1788,7 +1790,7 @@
     <w:rPr>
       <w:b w:val="0"/>
       <w:bCs w:val="0"/>
-      <w:color w:themeColor="accent1" w:themeShade="BF" w:val="365F91"/>
+      <w:color w:val="365F91" w:themeColor="accent1" w:themeShade="BF"/>
     </w:rPr>
   </w:style>
   <w:style w:type="paragraph" w:customStyle="1" w:styleId="SourceCode">

</xml_diff>